<commit_message>
Arrange CV contact table
</commit_message>
<xml_diff>
--- a/content/cv/reference.docx
+++ b/content/cv/reference.docx
@@ -194,12 +194,16 @@
       <w:tblPr>
         <w:tblStyle w:val="Table"/>
         <w:tblW w:w="0" w:type="auto"/>
+        <w:tblCellMar>
+          <w:left w:w="28" w:type="dxa"/>
+          <w:right w:w="28" w:type="dxa"/>
+        </w:tblCellMar>
         <w:tblLook w:val="07E0" w:firstRow="1" w:lastRow="1" w:firstColumn="1" w:lastColumn="1" w:noHBand="1" w:noVBand="1"/>
         <w:tblCaption w:val="Table caption."/>
       </w:tblPr>
       <w:tblGrid>
-        <w:gridCol w:w="749"/>
-        <w:gridCol w:w="749"/>
+        <w:gridCol w:w="589"/>
+        <w:gridCol w:w="589"/>
       </w:tblGrid>
       <w:tr>
         <w:trPr>
@@ -208,6 +212,7 @@
         <w:tc>
           <w:tcPr>
             <w:tcW w:w="0" w:type="auto"/>
+            <w:vAlign w:val="top"/>
           </w:tcPr>
           <w:p>
             <w:pPr>
@@ -221,6 +226,7 @@
         <w:tc>
           <w:tcPr>
             <w:tcW w:w="0" w:type="auto"/>
+            <w:vAlign w:val="top"/>
           </w:tcPr>
           <w:p>
             <w:pPr>
@@ -1023,15 +1029,17 @@
     <w:link w:val="TitleChar"/>
     <w:uiPriority w:val="10"/>
     <w:qFormat/>
-    <w:rsid w:val="00A10FD9"/>
+    <w:rsid w:val="009C5304"/>
     <w:pPr>
       <w:spacing w:after="80"/>
       <w:contextualSpacing/>
-      <w:jc w:val="center"/>
-    </w:pPr>
-    <w:rPr>
-      <w:rFonts w:asciiTheme="majorHAnsi" w:eastAsiaTheme="majorEastAsia" w:hAnsiTheme="majorHAnsi" w:cstheme="majorBidi"/>
-      <w:sz w:val="56"/>
+    </w:pPr>
+    <w:rPr>
+      <w:rFonts w:ascii="Arial Black" w:eastAsiaTheme="majorEastAsia" w:hAnsi="Arial Black" w:cs="Times New Roman (Headings CS)"/>
+      <w:b/>
+      <w:caps/>
+      <w:color w:val="0F4761" w:themeColor="accent1" w:themeShade="BF"/>
+      <w:sz w:val="32"/>
       <w:szCs w:val="56"/>
     </w:rPr>
   </w:style>
@@ -1040,10 +1048,13 @@
     <w:basedOn w:val="DefaultParagraphFont"/>
     <w:link w:val="Title"/>
     <w:uiPriority w:val="10"/>
-    <w:rsid w:val="00A10FD9"/>
-    <w:rPr>
-      <w:rFonts w:asciiTheme="majorHAnsi" w:eastAsiaTheme="majorEastAsia" w:hAnsiTheme="majorHAnsi" w:cstheme="majorBidi"/>
-      <w:sz w:val="56"/>
+    <w:rsid w:val="009C5304"/>
+    <w:rPr>
+      <w:rFonts w:ascii="Arial Black" w:eastAsiaTheme="majorEastAsia" w:hAnsi="Arial Black" w:cs="Times New Roman (Headings CS)"/>
+      <w:b/>
+      <w:caps/>
+      <w:color w:val="0F4761" w:themeColor="accent1" w:themeShade="BF"/>
+      <w:sz w:val="32"/>
       <w:szCs w:val="56"/>
     </w:rPr>
   </w:style>
@@ -1062,7 +1073,6 @@
     </w:pPr>
     <w:rPr>
       <w:spacing w:val="15"/>
-      <w:sz w:val="28"/>
       <w:szCs w:val="28"/>
     </w:rPr>
   </w:style>

</xml_diff>